<commit_message>
Align dissertation project with renamed repository
</commit_message>
<xml_diff>
--- a/docs/presentation/Breast_Cancer_Ultrasound_Dissertation.docx
+++ b/docs/presentation/Breast_Cancer_Ultrasound_Dissertation.docx
@@ -14,9 +14,9 @@
           <w:color w:val="062D2C"/>
           <w:sz w:val="54"/>
         </w:rPr>
-        <w:t>BREAST ULTRASOUND CLASSIFICATION</w:t>
+        <w:t>BREAST CANCER ULTRASOUND CLASSIFICATION</w:t>
         <w:br/>
-        <w:t>USING DEEP LEARNING</w:t>
+        <w:t>USING MACHINE LEARNING</w:t>
       </w:r>
     </w:p>
     <w:p>
@@ -30,9 +30,9 @@
           <w:i/>
           <w:sz w:val="30"/>
         </w:rPr>
-        <w:t>A reproducibility-focused study of preprocessing,</w:t>
+        <w:t>An auditable study of preprocessing, convolutional models,</w:t>
         <w:br/>
-        <w:t>convolutional models, and evidence integrity</w:t>
+        <w:t>and evidence integrity</w:t>
       </w:r>
     </w:p>
     <w:p>
@@ -85,7 +85,7 @@
               <w:br/>
             </w:r>
             <w:r>
-              <w:t>The current cohort fails the subject-level split audit.</w:t>
+              <w:t>BrEaST and OASBUD pass the subject-level split audit; BUSI is excluded because its patient identifiers are unavailable.</w:t>
               <w:br/>
               <w:t>This document makes no clinical-performance claim.</w:t>
             </w:r>
@@ -108,7 +108,7 @@
     </w:p>
     <w:p>
       <w:r>
-        <w:t>Breast ultrasound is affected by speckle, acquisition settings, lesion context, and operator technique. This dissertation develops a reproducible research prototype for binary classification of breast-ultrasound images using EfficientNet-B0, ResNet-50, and a custom convolutional baseline. The implementation combines configurable CLAHE, aspect-ratio-preserving square padding, machine-readable evaluation artifacts, and a FastAPI research interface. Its principal contribution is methodological: training, evaluation, command-line prediction, and API inference share one preprocessing path, while a read-only audit checks subject-level split integrity before metrics are interpreted. The supplied local cohort does not pass that audit. OASBUD and BrEaST subjects cross partitions, and renamed BUSI files do not retain enough provenance to verify patient separation. The bundled EfficientNet-B0 checkpoint achieved 78.33% accuracy and ROC-AUC 0.8612 on the current 120-image test folders; these values are provisional engineering evidence only. A defensible study requires a rebuilt subject-level cohort, preserved manifests, fixed seeds, stored per-image predictions, and regenerated tables and figures.</w:t>
+        <w:t>Breast ultrasound is affected by speckle, acquisition settings, lesion context, and operator technique. This dissertation develops a reproducible research prototype for binary classification of breast-ultrasound images using EfficientNet-B0, ResNet-50, and a custom convolutional baseline. The implementation combines configurable CLAHE, aspect-ratio-preserving square padding, machine-readable evaluation artifacts, and a FastAPI research interface. Its principal contribution is methodological: training, evaluation, command-line prediction, and API inference share one preprocessing path, while a read-only audit checks subject-level split integrity before metrics are interpreted. The supplied OASBUD and BrEaST folders have been rebuilt into subject-level splits with no cross-partition identifiers. BUSI remains excluded because its renamed files do not retain enough provenance to verify patient separation. The fresh EfficientNet-B0 checkpoint achieved 67.74% accuracy, macro F1 0.6774, and ROC-AUC 0.7419 on 62 held-out BrEaST and OASBUD images. These are local-cohort research results only, not clinical or external validation.</w:t>
       </w:r>
     </w:p>
     <w:p>
@@ -721,7 +721,7 @@
     </w:p>
     <w:p>
       <w:r>
-        <w:t>The supplied local data currently fails the third requirement. Identifiable OASBUD and BrEaST subjects occur across splits, and renamed BUSI files do not preserve enough provenance to verify patient separation. Current metrics are therefore provisional engineering evidence only.</w:t>
+        <w:t>The supplied OASBUD and BrEaST folders have now been rebuilt into subject-level splits with no cross-partition identifiers. The renamed BUSI files still do not preserve enough provenance to verify patient separation, so BUSI is excluded from validated training and evaluation. Current metrics are local-cohort research evidence only.</w:t>
       </w:r>
     </w:p>
     <w:p>
@@ -976,6 +976,59 @@
       </w:r>
     </w:p>
     <w:p>
+      <w:pPr>
+        <w:pStyle w:val="Heading2"/>
+      </w:pPr>
+      <w:r>
+        <w:t>2.6 Public breast-ultrasound datasets</w:t>
+      </w:r>
+    </w:p>
+    <w:p>
+      <w:r>
+        <w:t>The revised dissertation reviews five datasets discussed by Bristow and Yap: OASBUD, RODTOOK, UDIAT, BUSI, and BrEaST. They differ in country, scanner source, image formation, annotation, ground truth, and file organisation. Those differences affect both training and the meaning of a test result.</w:t>
+      </w:r>
+    </w:p>
+    <w:p>
+      <w:r>
+        <w:t>OASBUD and BrEaST were selected for the validated experiment because their local copies retain subject identifiers, paired lesion masks, and labels linked to biopsy or follow-up evidence. Their contrasting appearance also gives the local experiment some acquisition diversity. The study still has a narrow geographic base because both sources were collected in Poland.</w:t>
+      </w:r>
+    </w:p>
+    <w:p>
+      <w:r>
+        <w:t>RODTOOK and UDIAT were not in the supplied project data. Bringing them into the present experiment would require a fresh acquisition, licence review, curation pass, and frozen subject-level manifest. They are sensible external cohorts for later work.</w:t>
+      </w:r>
+    </w:p>
+    <w:p>
+      <w:r>
+        <w:t xml:space="preserve">BUSI was present only as a renamed 224 by 224 derivative. The generated </w:t>
+      </w:r>
+      <w:r>
+        <w:rPr>
+          <w:rFonts w:ascii="Aptos Mono" w:hAnsi="Aptos Mono"/>
+          <w:sz w:val="20"/>
+        </w:rPr>
+        <w:t>sample_*</w:t>
+      </w:r>
+      <w:r>
+        <w:t xml:space="preserve"> identifiers cannot be traced back to the original cases, and the visible images show repeated banding. Published correspondence also reports duplicates and inconsistent cases in the public release. The local derivative is therefore illustrated in the report but excluded from validated training and evaluation.</w:t>
+      </w:r>
+    </w:p>
+    <w:p>
+      <w:r>
+        <w:t>The dataset plate is stored at [</w:t>
+      </w:r>
+      <w:r>
+        <w:rPr>
+          <w:rFonts w:ascii="Aptos Mono" w:hAnsi="Aptos Mono"/>
+          <w:sz w:val="20"/>
+        </w:rPr>
+        <w:t>latex_university/figures/fig9_dataset_quality_examples.png</w:t>
+      </w:r>
+      <w:r>
+        <w:t>](../../latex_university/figures/fig9_dataset_quality_examples.png). It shows benign and malignant examples from the three local folders while making the BUSI derivative status explicit.</w:t>
+      </w:r>
+    </w:p>
+    <w:p>
       <w:r>
         <w:br w:type="page"/>
       </w:r>
@@ -1029,37 +1082,7 @@
     </w:p>
     <w:p>
       <w:r>
-        <w:t xml:space="preserve">The combined loader currently finds 402 training, 107 validation, and 120 test images. OASBUD subject </w:t>
-      </w:r>
-      <w:r>
-        <w:rPr>
-          <w:rFonts w:ascii="Aptos Mono" w:hAnsi="Aptos Mono"/>
-          <w:sz w:val="20"/>
-        </w:rPr>
-        <w:t>30nh</w:t>
-      </w:r>
-      <w:r>
-        <w:t xml:space="preserve"> spans training and validation; BrEaST cases </w:t>
-      </w:r>
-      <w:r>
-        <w:rPr>
-          <w:rFonts w:ascii="Aptos Mono" w:hAnsi="Aptos Mono"/>
-          <w:sz w:val="20"/>
-        </w:rPr>
-        <w:t>case140</w:t>
-      </w:r>
-      <w:r>
-        <w:t xml:space="preserve"> and </w:t>
-      </w:r>
-      <w:r>
-        <w:rPr>
-          <w:rFonts w:ascii="Aptos Mono" w:hAnsi="Aptos Mono"/>
-          <w:sz w:val="20"/>
-        </w:rPr>
-        <w:t>case151</w:t>
-      </w:r>
-      <w:r>
-        <w:t xml:space="preserve"> span partitions; and BUSI patient separation cannot be reconstructed from the renamed files. Training therefore stops by default unless </w:t>
+        <w:t xml:space="preserve">The validated loader uses BrEaST and OASBUD only and finds 302 training, 63 validation, and 62 test images after subject-level rebuilding. The audit reports no cross-partition identifiers in either dataset. BUSI patient separation cannot be reconstructed from its renamed files, so it is excluded by default; training still stops if any configured dataset fails its audit unless </w:t>
       </w:r>
       <w:r>
         <w:rPr>
@@ -1310,7 +1333,7 @@
     </w:p>
     <w:p>
       <w:r>
-        <w:t>The current bundled checkpoint was produced before the strengthened metadata schema. Its latest evaluation on the unaudited 120-image test folders is reported only as a provisional software-regression result in Chapter 5.</w:t>
+        <w:t>The current EfficientNet-B0 checkpoint was retrained after rebuilding BrEaST and OASBUD subject-level splits. Its evaluation on the 62-image held-out test partition is reported as local-cohort research evidence in Chapter 5; BUSI is excluded because its source identifiers are unavailable.</w:t>
       </w:r>
     </w:p>
     <w:p>
@@ -1341,42 +1364,12 @@
     </w:p>
     <w:p>
       <w:r>
-        <w:t>The current project supports an end-to-end evaluation run but not a valid clinical-performance claim. The configured combined loader has 402 training, 107 validation, and 120 test images. The supplied checkpoint evaluated at 78.33% accuracy, macro F1 0.7811, and ROC-AUC 0.8612 on the current test partition.</w:t>
+        <w:t>The repaired validated loader uses BrEaST and OASBUD only, with 302 training, 63 validation, and 62 held-out test images. The fresh EfficientNet-B0 checkpoint achieved 67.74% accuracy, macro F1 0.6774, and ROC-AUC 0.7419 on that test partition.</w:t>
       </w:r>
     </w:p>
     <w:p>
       <w:r>
-        <w:t xml:space="preserve">These values are provisional because the split audit finds OASBUD subject </w:t>
-      </w:r>
-      <w:r>
-        <w:rPr>
-          <w:rFonts w:ascii="Aptos Mono" w:hAnsi="Aptos Mono"/>
-          <w:sz w:val="20"/>
-        </w:rPr>
-        <w:t>30nh</w:t>
-      </w:r>
-      <w:r>
-        <w:t xml:space="preserve"> in training and validation and BrEaST cases </w:t>
-      </w:r>
-      <w:r>
-        <w:rPr>
-          <w:rFonts w:ascii="Aptos Mono" w:hAnsi="Aptos Mono"/>
-          <w:sz w:val="20"/>
-        </w:rPr>
-        <w:t>case140</w:t>
-      </w:r>
-      <w:r>
-        <w:t xml:space="preserve"> and </w:t>
-      </w:r>
-      <w:r>
-        <w:rPr>
-          <w:rFonts w:ascii="Aptos Mono" w:hAnsi="Aptos Mono"/>
-          <w:sz w:val="20"/>
-        </w:rPr>
-        <w:t>case151</w:t>
-      </w:r>
-      <w:r>
-        <w:t xml:space="preserve"> in multiple partitions. The local BUSI files were renamed, so their patient-level independence cannot be verified. Do not compare architectures, cite confidence intervals, or make clinical inferences from this cohort.</w:t>
+        <w:t>The split audit passes for BrEaST and OASBUD with no subject crossing partitions. BUSI remains excluded because its local files were renamed and patient-level independence cannot be verified. The result is therefore a local-cohort research finding, not a clinical-performance estimate. Do not make clinical inferences or claim external generalisation.</w:t>
       </w:r>
     </w:p>
     <w:p>
@@ -1412,6 +1405,36 @@
       </w:r>
       <w:r>
         <w:t>. All final tables and figures must be derived from per-run saved predictions after the cohort is reconstructed at subject level.</w:t>
+      </w:r>
+    </w:p>
+    <w:p>
+      <w:r>
+        <w:t xml:space="preserve">The revised results chapter also includes four image-level outcomes selected by a fixed rule from </w:t>
+      </w:r>
+      <w:r>
+        <w:rPr>
+          <w:rFonts w:ascii="Aptos Mono" w:hAnsi="Aptos Mono"/>
+          <w:sz w:val="20"/>
+        </w:rPr>
+        <w:t>outputs/predictions.csv</w:t>
+      </w:r>
+      <w:r>
+        <w:t>: the lowest-probability correct benign case, the highest-probability correct malignant case, the highest-probability false positive, and the lowest-probability false negative. The plate uses the same ROI crop and CLAHE path as evaluation. It supports transparent error review without claiming that visual inspection reveals why the network made a decision.</w:t>
+      </w:r>
+    </w:p>
+    <w:p>
+      <w:r>
+        <w:t>See [</w:t>
+      </w:r>
+      <w:r>
+        <w:rPr>
+          <w:rFonts w:ascii="Aptos Mono" w:hAnsi="Aptos Mono"/>
+          <w:sz w:val="20"/>
+        </w:rPr>
+        <w:t>latex_university/figures/fig10_prediction_examples.png</w:t>
+      </w:r>
+      <w:r>
+        <w:t>](../../latex_university/figures/fig10_prediction_examples.png) for the generated plate.</w:t>
       </w:r>
     </w:p>
     <w:p>
@@ -1467,7 +1490,7 @@
         <w:jc w:val="center"/>
       </w:pPr>
       <w:r>
-        <w:t>Figure 1. Confusion matrix for the provisional 120-image checkpoint run.</w:t>
+        <w:t>Figure 1. Confusion matrix for the audited 62-image checkpoint run.</w:t>
       </w:r>
     </w:p>
     <w:p>
@@ -1515,7 +1538,7 @@
         <w:jc w:val="center"/>
       </w:pPr>
       <w:r>
-        <w:t>Figure 2. Receiver operating characteristic for the same provisional run.</w:t>
+        <w:t>Figure 2. Receiver operating characteristic for the same audited run.</w:t>
       </w:r>
     </w:p>
     <w:p>

</xml_diff>